<commit_message>
feature/fixed rendering of tables and button + new labels in templates
</commit_message>
<xml_diff>
--- a/converted_files/Письмо о допуске.docx
+++ b/converted_files/Письмо о допуске.docx
@@ -143,14 +143,6 @@
               <w:t>Заместителю генерального директора ООО «Мяу Кусь»</w:t>
             </w:r>
             <w:proofErr w:type="spellStart"/>
-            <w:proofErr w:type="gramStart"/>
-            <w:r>
-              <w:rPr>
-                <w:b/>
-                <w:lang w:eastAsia="en-US"/>
-              </w:rPr>
-            </w:r>
-            <w:proofErr w:type="gramEnd"/>
             <w:r>
               <w:rPr>
                 <w:b/>
@@ -165,14 +157,6 @@
               </w:rPr>
             </w:r>
             <w:proofErr w:type="spellStart"/>
-            <w:proofErr w:type="gramStart"/>
-            <w:r>
-              <w:rPr>
-                <w:b/>
-                <w:lang w:eastAsia="en-US"/>
-              </w:rPr>
-            </w:r>
-            <w:proofErr w:type="gramEnd"/>
             <w:r>
               <w:rPr>
                 <w:b/>
@@ -207,17 +191,9 @@
                 <w:b/>
                 <w:bCs/>
               </w:rPr>
-              <w:t>Иванов А.И.</w:t>
+              <w:t>Иванов И.</w:t>
             </w:r>
             <w:proofErr w:type="spellStart"/>
-            <w:proofErr w:type="gramStart"/>
-            <w:r>
-              <w:rPr>
-                <w:b/>
-                <w:bCs/>
-              </w:rPr>
-            </w:r>
-            <w:proofErr w:type="gramEnd"/>
             <w:r>
               <w:rPr>
                 <w:b/>
@@ -257,8 +233,13 @@
             <w:vAlign w:val="center"/>
           </w:tcPr>
           <w:p>
+            <w:pPr>
+              <w:jc w:val="center"/>
+            </w:pPr>
             <w:r>
-              <w:t>235345</w:t>
+              <w:rPr>
+                <w:i/>
+              </w:rPr>
             </w:r>
           </w:p>
         </w:tc>
@@ -304,8 +285,13 @@
             <w:vAlign w:val="center"/>
           </w:tcPr>
           <w:p>
+            <w:pPr>
+              <w:jc w:val="center"/>
+            </w:pPr>
             <w:r>
-              <w:t>3244234</w:t>
+              <w:rPr>
+                <w:i/>
+              </w:rPr>
             </w:r>
           </w:p>
         </w:tc>
@@ -503,7 +489,7 @@
         <w:rPr>
           <w:b/>
         </w:rPr>
-        <w:t>Уважаемый Андрей Игоревич!</w:t>
+        <w:t>Уважаемый И.И.!</w:t>
       </w:r>
       <w:r>
         <w:rPr>
@@ -516,13 +502,6 @@
         </w:rPr>
       </w:r>
       <w:proofErr w:type="spellStart"/>
-      <w:proofErr w:type="gramStart"/>
-      <w:r>
-        <w:rPr>
-          <w:b/>
-        </w:rPr>
-      </w:r>
-      <w:proofErr w:type="gramEnd"/>
       <w:r>
         <w:rPr>
           <w:b/>
@@ -547,7 +526,7 @@
         <w:jc w:val="both"/>
       </w:pPr>
       <w:r>
-        <w:t>Прошу Вас, согласовать допуск сотрудника ООО «УЦСБ» на площадку ООО «Мяу Кусь» согласно Приложению №1 в период с 235345 по 235345 г., в том числе в выходные и праздничные дни, в целях выполнения мероприятий по проведению сбора исходных данных в рамках проектирования «Дооснащение подсистем безопасности объектов критической информационной инфраструктуры Невьянского ЛПУМГ ООО «Мяу мышь» (2-я очередь)»(руками) с использованием служебного АРМ без подключения к ЛВС.</w:t>
+        <w:t>Прошу Вас, согласовать допуск сотрудника ООО «УЦСБ» на площадку ООО «Мяу Кусь» согласно Приложению №1 в период с 123123 по 756756756 г., в том числе в выходные и праздничные дни, в целях выполнения мероприятий по проведению сбора исходных данных в рамках проектирования «Дооснащение подсистем безопасности объектов критической информационной инфраструктуры Невьянского ЛПУМГ ООО «Мяу мышь» (2-я очередь)»(руками) с использованием служебного АРМ без подключения к ЛВС.</w:t>
       </w:r>
     </w:p>
     <w:p>
@@ -690,7 +669,6 @@
               <w:t>Генеральный директор</w:t>
             </w:r>
             <w:proofErr w:type="spellStart"/>
-            <w:proofErr w:type="gramStart"/>
             <w:r>
               <w:rPr>
                 <w:lang w:val="en-US"/>
@@ -703,7 +681,6 @@
               </w:rPr>
             </w:r>
             <w:r/>
-            <w:proofErr w:type="gramEnd"/>
             <w:r>
               <w:rPr>
                 <w:lang w:val="en-US"/>
@@ -946,13 +923,6 @@
         </w:rPr>
       </w:r>
       <w:proofErr w:type="spellStart"/>
-      <w:proofErr w:type="gramStart"/>
-      <w:r>
-        <w:rPr>
-          <w:b/>
-        </w:rPr>
-      </w:r>
-      <w:proofErr w:type="gramEnd"/>
       <w:r>
         <w:rPr>
           <w:b/>
@@ -978,9 +948,9 @@
         <w:tblLook w:val="04A0" w:firstRow="1" w:lastRow="0" w:firstColumn="1" w:lastColumn="0" w:noHBand="0" w:noVBand="1"/>
       </w:tblPr>
       <w:tblGrid>
-        <w:gridCol w:w="565"/>
-        <w:gridCol w:w="2725"/>
-        <w:gridCol w:w="2753"/>
+        <w:gridCol w:w="563"/>
+        <w:gridCol w:w="2762"/>
+        <w:gridCol w:w="2718"/>
         <w:gridCol w:w="3918"/>
       </w:tblGrid>
       <w:tr>
@@ -990,7 +960,7 @@
         </w:trPr>
         <w:tc>
           <w:tcPr>
-            <w:tcW w:w="567" w:type="dxa"/>
+            <w:tcW w:w="563" w:type="dxa"/>
             <w:vAlign w:val="center"/>
           </w:tcPr>
           <w:p>
@@ -1017,7 +987,7 @@
         </w:tc>
         <w:tc>
           <w:tcPr>
-            <w:tcW w:w="3260" w:type="dxa"/>
+            <w:tcW w:w="2762" w:type="dxa"/>
             <w:vAlign w:val="center"/>
           </w:tcPr>
           <w:p>
@@ -1050,10 +1020,7 @@
         </w:tc>
         <w:tc>
           <w:tcPr>
-            <w:tcW w:w="3260" w:type="dxa"/>
-            <w:tcBorders>
-              <w:bottom w:val="single" w:sz="4" w:space="0" w:color="auto"/>
-            </w:tcBorders>
+            <w:tcW w:w="2718" w:type="dxa"/>
             <w:vAlign w:val="center"/>
           </w:tcPr>
           <w:p>
@@ -1076,10 +1043,7 @@
         </w:tc>
         <w:tc>
           <w:tcPr>
-            <w:tcW w:w="2874" w:type="dxa"/>
-            <w:tcBorders>
-              <w:bottom w:val="single" w:sz="4" w:space="0" w:color="auto"/>
-            </w:tcBorders>
+            <w:tcW w:w="3918" w:type="dxa"/>
             <w:vAlign w:val="center"/>
           </w:tcPr>
           <w:p>
@@ -1121,300 +1085,6 @@
           </w:p>
         </w:tc>
       </w:tr>
-      <w:tr>
-        <w:tc>
-          <w:tcPr>
-            <w:tcW w:type="dxa" w:w="565"/>
-          </w:tcPr>
-          <w:p>
-            <w:pPr>
-              <w:spacing w:after="0" w:line="800" w:lineRule="exact"/>
-            </w:pPr>
-            <w:r>
-              <w:t>1</w:t>
-            </w:r>
-          </w:p>
-        </w:tc>
-        <w:tc>
-          <w:tcPr>
-            <w:tcW w:type="dxa" w:w="2725"/>
-          </w:tcPr>
-          <w:p>
-            <w:pPr>
-              <w:spacing w:after="0" w:line="800" w:lineRule="exact"/>
-            </w:pPr>
-            <w:r>
-              <w:t>{инженер.фио}</w:t>
-            </w:r>
-          </w:p>
-        </w:tc>
-        <w:tc>
-          <w:tcPr>
-            <w:tcW w:type="dxa" w:w="2753"/>
-          </w:tcPr>
-          <w:p>
-            <w:pPr>
-              <w:spacing w:after="0" w:line="800" w:lineRule="exact"/>
-            </w:pPr>
-            <w:r>
-              <w:t>{инженер.ноутбук}</w:t>
-            </w:r>
-          </w:p>
-        </w:tc>
-        <w:tc>
-          <w:tcPr>
-            <w:tcW w:type="dxa" w:w="3918"/>
-          </w:tcPr>
-          <w:p>
-            <w:r/>
-          </w:p>
-        </w:tc>
-      </w:tr>
-      <w:tr>
-        <w:tc>
-          <w:tcPr>
-            <w:tcW w:type="dxa" w:w="565"/>
-          </w:tcPr>
-          <w:p>
-            <w:pPr>
-              <w:spacing w:after="0" w:line="800" w:lineRule="exact"/>
-            </w:pPr>
-            <w:r>
-              <w:t>2</w:t>
-            </w:r>
-          </w:p>
-        </w:tc>
-        <w:tc>
-          <w:tcPr>
-            <w:tcW w:type="dxa" w:w="2725"/>
-          </w:tcPr>
-          <w:p>
-            <w:pPr>
-              <w:spacing w:after="0" w:line="800" w:lineRule="exact"/>
-            </w:pPr>
-            <w:r>
-              <w:t>{инженер.фио}</w:t>
-            </w:r>
-          </w:p>
-        </w:tc>
-        <w:tc>
-          <w:tcPr>
-            <w:tcW w:type="dxa" w:w="2753"/>
-          </w:tcPr>
-          <w:p>
-            <w:pPr>
-              <w:spacing w:after="0" w:line="800" w:lineRule="exact"/>
-            </w:pPr>
-            <w:r>
-              <w:t>{инженер.ноутбук}</w:t>
-            </w:r>
-          </w:p>
-        </w:tc>
-        <w:tc>
-          <w:tcPr>
-            <w:tcW w:type="dxa" w:w="3918"/>
-          </w:tcPr>
-          <w:p>
-            <w:r/>
-          </w:p>
-        </w:tc>
-      </w:tr>
-      <w:tr>
-        <w:tc>
-          <w:tcPr>
-            <w:tcW w:type="dxa" w:w="565"/>
-          </w:tcPr>
-          <w:p>
-            <w:pPr>
-              <w:spacing w:after="0" w:line="800" w:lineRule="exact"/>
-            </w:pPr>
-            <w:r>
-              <w:t>3</w:t>
-            </w:r>
-          </w:p>
-        </w:tc>
-        <w:tc>
-          <w:tcPr>
-            <w:tcW w:type="dxa" w:w="2725"/>
-          </w:tcPr>
-          <w:p>
-            <w:pPr>
-              <w:spacing w:after="0" w:line="800" w:lineRule="exact"/>
-            </w:pPr>
-            <w:r>
-              <w:t>{инженер.фио}</w:t>
-            </w:r>
-          </w:p>
-        </w:tc>
-        <w:tc>
-          <w:tcPr>
-            <w:tcW w:type="dxa" w:w="2753"/>
-          </w:tcPr>
-          <w:p>
-            <w:pPr>
-              <w:spacing w:after="0" w:line="800" w:lineRule="exact"/>
-            </w:pPr>
-            <w:r>
-              <w:t>{инженер.ноутбук}</w:t>
-            </w:r>
-          </w:p>
-        </w:tc>
-        <w:tc>
-          <w:tcPr>
-            <w:tcW w:type="dxa" w:w="3918"/>
-          </w:tcPr>
-          <w:p>
-            <w:r/>
-          </w:p>
-        </w:tc>
-      </w:tr>
-      <w:tr>
-        <w:tc>
-          <w:tcPr>
-            <w:tcW w:type="dxa" w:w="565"/>
-          </w:tcPr>
-          <w:p>
-            <w:pPr>
-              <w:spacing w:after="0" w:line="800" w:lineRule="exact"/>
-            </w:pPr>
-            <w:r>
-              <w:t>4</w:t>
-            </w:r>
-          </w:p>
-        </w:tc>
-        <w:tc>
-          <w:tcPr>
-            <w:tcW w:type="dxa" w:w="2725"/>
-          </w:tcPr>
-          <w:p>
-            <w:pPr>
-              <w:spacing w:after="0" w:line="800" w:lineRule="exact"/>
-            </w:pPr>
-            <w:r>
-              <w:t>{инженер.фио}</w:t>
-            </w:r>
-          </w:p>
-        </w:tc>
-        <w:tc>
-          <w:tcPr>
-            <w:tcW w:type="dxa" w:w="2753"/>
-          </w:tcPr>
-          <w:p>
-            <w:pPr>
-              <w:spacing w:after="0" w:line="800" w:lineRule="exact"/>
-            </w:pPr>
-            <w:r>
-              <w:t>{инженер.ноутбук}</w:t>
-            </w:r>
-          </w:p>
-        </w:tc>
-        <w:tc>
-          <w:tcPr>
-            <w:tcW w:type="dxa" w:w="3918"/>
-          </w:tcPr>
-          <w:p>
-            <w:r/>
-          </w:p>
-        </w:tc>
-      </w:tr>
-      <w:tr>
-        <w:tc>
-          <w:tcPr>
-            <w:tcW w:type="dxa" w:w="565"/>
-          </w:tcPr>
-          <w:p>
-            <w:pPr>
-              <w:spacing w:after="0" w:line="800" w:lineRule="exact"/>
-            </w:pPr>
-            <w:r>
-              <w:t>5</w:t>
-            </w:r>
-          </w:p>
-        </w:tc>
-        <w:tc>
-          <w:tcPr>
-            <w:tcW w:type="dxa" w:w="2725"/>
-          </w:tcPr>
-          <w:p>
-            <w:pPr>
-              <w:spacing w:after="0" w:line="800" w:lineRule="exact"/>
-            </w:pPr>
-            <w:r>
-              <w:t>{инженер.фио}</w:t>
-            </w:r>
-          </w:p>
-        </w:tc>
-        <w:tc>
-          <w:tcPr>
-            <w:tcW w:type="dxa" w:w="2753"/>
-          </w:tcPr>
-          <w:p>
-            <w:pPr>
-              <w:spacing w:after="0" w:line="800" w:lineRule="exact"/>
-            </w:pPr>
-            <w:r>
-              <w:t>{инженер.ноутбук}</w:t>
-            </w:r>
-          </w:p>
-        </w:tc>
-        <w:tc>
-          <w:tcPr>
-            <w:tcW w:type="dxa" w:w="3918"/>
-          </w:tcPr>
-          <w:p>
-            <w:r/>
-          </w:p>
-        </w:tc>
-      </w:tr>
-      <w:tr>
-        <w:tc>
-          <w:tcPr>
-            <w:tcW w:type="dxa" w:w="565"/>
-          </w:tcPr>
-          <w:p>
-            <w:pPr>
-              <w:spacing w:after="0" w:line="800" w:lineRule="exact"/>
-            </w:pPr>
-            <w:r>
-              <w:t>6</w:t>
-            </w:r>
-          </w:p>
-        </w:tc>
-        <w:tc>
-          <w:tcPr>
-            <w:tcW w:type="dxa" w:w="2725"/>
-          </w:tcPr>
-          <w:p>
-            <w:pPr>
-              <w:spacing w:after="0" w:line="800" w:lineRule="exact"/>
-            </w:pPr>
-            <w:r>
-              <w:t>{инженер.фио}</w:t>
-            </w:r>
-          </w:p>
-        </w:tc>
-        <w:tc>
-          <w:tcPr>
-            <w:tcW w:type="dxa" w:w="2753"/>
-          </w:tcPr>
-          <w:p>
-            <w:pPr>
-              <w:spacing w:after="0" w:line="800" w:lineRule="exact"/>
-            </w:pPr>
-            <w:r>
-              <w:t>{инженер.ноутбук}</w:t>
-            </w:r>
-          </w:p>
-        </w:tc>
-        <w:tc>
-          <w:tcPr>
-            <w:tcW w:type="dxa" w:w="3918"/>
-          </w:tcPr>
-          <w:p>
-            <w:r/>
-          </w:p>
-        </w:tc>
-      </w:tr>
     </w:tbl>
     <w:p/>
     <w:sectPr>
@@ -1572,18 +1242,8 @@
         <w:sz w:val="16"/>
         <w:szCs w:val="16"/>
       </w:rPr>
-      <w:t xml:space="preserve">Исп.: Гараева </w:t>
+      <w:t>Исп.: Гараева К.Д</w:t>
     </w:r>
-    <w:proofErr w:type="gramStart"/>
-    <w:r>
-      <w:rPr>
-        <w:color w:val="000000"/>
-        <w:sz w:val="16"/>
-        <w:szCs w:val="16"/>
-      </w:rPr>
-      <w:t>К.Д</w:t>
-    </w:r>
-    <w:proofErr w:type="gramEnd"/>
   </w:p>
   <w:p>
     <w:pPr>

</xml_diff>